<commit_message>
Page Equipe (photo CEO + 2 profils), fusion des deux slides Appel a l'action
Co-authored-by: arena-agent <297053741+arena-agent@users.noreply.github.com>
</commit_message>
<xml_diff>
--- a/Pitch_Oral_Sadiya_Digital_Agri.docx
+++ b/Pitch_Oral_Sadiya_Digital_Agri.docx
@@ -869,7 +869,7 @@
                 <w:color w:val="FFFFFF"/>
                 <w:sz w:val="23"/>
               </w:rPr>
-              <w:t>6 · Ce que j'ai déjà réalisé</w:t>
+              <w:t>6 · Réalisations &amp; équipe</w:t>
             </w:r>
           </w:p>
         </w:tc>
@@ -890,7 +890,7 @@
                 <w:color w:val="1AAB70"/>
                 <w:sz w:val="17"/>
               </w:rPr>
-              <w:t>Slides 18–20  |  3:30 → 4:05</w:t>
+              <w:t>Slides 18–21  |  3:30 → 4:05</w:t>
             </w:r>
           </w:p>
         </w:tc>
@@ -931,6 +931,22 @@
           <w:sz w:val="22"/>
         </w:rPr>
         <w:t>Mon ambition, maintenant, c'est de signer mes cinq premiers clients, de construire un portefeuille récurrent, et de faire de Sadiya Digital Agri la référence de la communication digitale agroalimentaire au Sénégal.</w:t>
+      </w:r>
+    </w:p>
+    <w:p>
+      <w:pPr>
+        <w:spacing w:before="0" w:after="160" w:line="336" w:lineRule="auto"/>
+        <w:jc w:val="both"/>
+      </w:pPr>
+      <w:r>
+        <w:rPr>
+          <w:rFonts w:ascii="Poppins" w:hAnsi="Poppins"/>
+          <w:b w:val="0"/>
+          <w:i w:val="0"/>
+          <w:color w:val="0A1A01"/>
+          <w:sz w:val="22"/>
+        </w:rPr>
+        <w:t>Aujourd'hui je porte l'activité seule. Dès le troisième client régulier, je m'entourerai de deux profils en freelance : une créatrice de contenu pour la production visuelle et vidéo, et un responsable commercial pour la prospection.</w:t>
       </w:r>
     </w:p>
     <w:p>
@@ -1000,7 +1016,7 @@
                 <w:color w:val="1AAB70"/>
                 <w:sz w:val="17"/>
               </w:rPr>
-              <w:t>Slides 21–22  |  4:05 → 4:30</w:t>
+              <w:t>Slide 22  |  4:05 → 4:30</w:t>
             </w:r>
           </w:p>
         </w:tc>

</xml_diff>

<commit_message>
Restructuration: Contexte & Problematique, Solution avec logo, Benchmarking, Bibliographie; textes allegés et polices agrandies
Co-authored-by: arena-agent <297053741+arena-agent@users.noreply.github.com>
</commit_message>
<xml_diff>
--- a/Pitch_Oral_Sadiya_Digital_Agri.docx
+++ b/Pitch_Oral_Sadiya_Digital_Agri.docx
@@ -292,7 +292,7 @@
                 <w:color w:val="1AAB70"/>
                 <w:sz w:val="17"/>
               </w:rPr>
-              <w:t>Slides 1–2  |  0:00 → 0:35</w:t>
+              <w:t>Slides 1 à 3  |  0:00 → 0:35</w:t>
             </w:r>
           </w:p>
         </w:tc>
@@ -381,7 +381,7 @@
                 <w:color w:val="FFFFFF"/>
                 <w:sz w:val="23"/>
               </w:rPr>
-              <w:t>2 · Le problème</w:t>
+              <w:t>2 · Contexte &amp; problématique</w:t>
             </w:r>
           </w:p>
         </w:tc>
@@ -402,7 +402,7 @@
                 <w:color w:val="1AAB70"/>
                 <w:sz w:val="17"/>
               </w:rPr>
-              <w:t>Slide 3  |  0:35 → 1:10</w:t>
+              <w:t>Slide 2  |  0:35 → 1:10</w:t>
             </w:r>
           </w:p>
         </w:tc>
@@ -512,7 +512,7 @@
                 <w:color w:val="1AAB70"/>
                 <w:sz w:val="17"/>
               </w:rPr>
-              <w:t>Slides 4–5  |  1:10 → 1:55</w:t>
+              <w:t>Slides 4 et 5  |  1:10 → 1:55</w:t>
             </w:r>
           </w:p>
         </w:tc>
@@ -638,7 +638,7 @@
                 <w:color w:val="1AAB70"/>
                 <w:sz w:val="17"/>
               </w:rPr>
-              <w:t>Slides 6–13  |  1:55 → 2:50</w:t>
+              <w:t>Slides 6 à 13  |  1:55 → 2:50</w:t>
             </w:r>
           </w:p>
         </w:tc>
@@ -759,7 +759,7 @@
                 <w:color w:val="FFFFFF"/>
                 <w:sz w:val="23"/>
               </w:rPr>
-              <w:t>5 · Le modèle économique</w:t>
+              <w:t>5 · Modèle économique &amp; benchmark</w:t>
             </w:r>
           </w:p>
         </w:tc>
@@ -780,7 +780,7 @@
                 <w:color w:val="1AAB70"/>
                 <w:sz w:val="17"/>
               </w:rPr>
-              <w:t>Slides 14–17  |  2:50 → 3:30</w:t>
+              <w:t>Slides 14 à 17  |  2:50 → 3:30</w:t>
             </w:r>
           </w:p>
         </w:tc>
@@ -825,6 +825,22 @@
     </w:p>
     <w:p>
       <w:pPr>
+        <w:spacing w:before="0" w:after="160" w:line="336" w:lineRule="auto"/>
+        <w:jc w:val="both"/>
+      </w:pPr>
+      <w:r>
+        <w:rPr>
+          <w:rFonts w:ascii="Poppins" w:hAnsi="Poppins"/>
+          <w:b w:val="0"/>
+          <w:i w:val="0"/>
+          <w:color w:val="0A1A01"/>
+          <w:sz w:val="22"/>
+        </w:rPr>
+        <w:t>Face à la concurrence, ma différence tient en une phrase : je suis la seule à combiner expertise agronomique et maîtrise digitale. Les agences établies ont la méthode mais pas la connaissance du secteur ; les freelances ont les tarifs mais pas la stratégie.</w:t>
+      </w:r>
+    </w:p>
+    <w:p>
+      <w:pPr>
         <w:spacing w:before="0" w:after="240"/>
         <w:ind w:left="227"/>
         <w:pBdr>
@@ -838,7 +854,7 @@
           <w:color w:val="42612D"/>
           <w:sz w:val="17"/>
         </w:rPr>
-        <w:t>Annoncer le seuil de rentabilité avec assurance : c'est ce qu'un jury retient d'un business model.</w:t>
+        <w:t>Annoncer le seuil de rentabilité avec assurance, puis enchaîner sur le benchmark : c'est ce qu'un jury retient d'un business model.</w:t>
       </w:r>
     </w:p>
     <w:tbl>
@@ -890,7 +906,7 @@
                 <w:color w:val="1AAB70"/>
                 <w:sz w:val="17"/>
               </w:rPr>
-              <w:t>Slides 18–21  |  3:30 → 4:05</w:t>
+              <w:t>Slides 18 à 21  |  3:30 → 4:05</w:t>
             </w:r>
           </w:p>
         </w:tc>

</xml_diff>

<commit_message>
Integration des donnees sourcees (DataReportal, Min. Dev. industriel), tarifs benchmark reels, bibliographie corrigee
Co-authored-by: arena-agent <297053741+arena-agent@users.noreply.github.com>
</commit_message>
<xml_diff>
--- a/Pitch_Oral_Sadiya_Digital_Agri.docx
+++ b/Pitch_Oral_Sadiya_Digital_Agri.docx
@@ -426,7 +426,23 @@
           <w:color w:val="0A1A01"/>
           <w:sz w:val="22"/>
         </w:rPr>
-        <w:t>Aujourd'hui, les entreprises agroalimentaires sénégalaises font face à trois freins. D'abord, une présence très faible sur les réseaux sociaux : des pages inactives, des publications rares. Ensuite, un manque de stratégie : on publie sans objectif et sans calendrier. Et enfin, une visibilité qui ne convertit pas : quelques vues, parfois des likes, mais aucun client au bout.</w:t>
+        <w:t>Regardons le contexte. Fin 2025, le Sénégal compte onze millions cinq cent mille internautes, soit plus de soixante pour cent de la population, et cinq millions quatre cent mille identités actives sur les réseaux sociaux. Nos concitoyens y passent en moyenne deux heures vingt-quatre par jour. Et soixante-trois pour cent des PMI industrielles du pays évoluent dans l'agroalimentaire.</w:t>
+      </w:r>
+    </w:p>
+    <w:p>
+      <w:pPr>
+        <w:spacing w:before="0" w:after="160" w:line="336" w:lineRule="auto"/>
+        <w:jc w:val="both"/>
+      </w:pPr>
+      <w:r>
+        <w:rPr>
+          <w:rFonts w:ascii="Poppins" w:hAnsi="Poppins"/>
+          <w:b w:val="0"/>
+          <w:i w:val="0"/>
+          <w:color w:val="0A1A01"/>
+          <w:sz w:val="22"/>
+        </w:rPr>
+        <w:t>Le marché est donc là. Pourtant les entreprises agroalimentaires font face à trois freins : une présence très faible sur les réseaux, un manque de stratégie — on publie sans objectif ni calendrier — et une visibilité qui ne convertit pas : des vues, parfois des likes, mais aucun client au bout.</w:t>
       </w:r>
     </w:p>
     <w:p>
@@ -710,7 +726,7 @@
           <w:color w:val="0A1A01"/>
           <w:sz w:val="22"/>
         </w:rPr>
-        <w:t>Ma stratégie repose sur trois réseaux aux rôles complémentaires : TikTok attire l'attention, Facebook fédère la communauté, LinkedIn crédibilise et permet de prospecter. Concrètement, je publie trois jours par semaine, selon un calendrier éditorial construit sur cinq piliers de contenu. Et chaque mois, je mesure : portée, demandes reçues, contrats signés — puis j'ajuste.</w:t>
+        <w:t>Ma stratégie repose sur trois réseaux complémentaires : TikTok attire, Facebook fédère, LinkedIn crédibilise et permet de prospecter. Je publie trois jours par semaine, et chaque mois je mesure la portée, les demandes et les contrats signés — puis j'ajuste.</w:t>
       </w:r>
     </w:p>
     <w:p>
@@ -804,7 +820,7 @@
           <w:color w:val="0A1A01"/>
           <w:sz w:val="22"/>
         </w:rPr>
-        <w:t>Mon modèle économique repose sur l'abonnement mensuel, avec trois formules : Essentiel à soixante-quinze mille francs, Pro à cent cinquante mille, et Premium à deux cent cinquante mille francs par mois. S'y ajoutent des prestations ponctuelles à partir de vingt-cinq mille francs.</w:t>
+        <w:t>Mon modèle repose sur l'abonnement mensuel : Essentiel à soixante-quinze mille francs, Pro à cent cinquante mille, Premium à deux cent cinquante mille, plus des prestations ponctuelles dès vingt-cinq mille.</w:t>
       </w:r>
     </w:p>
     <w:p>
@@ -836,7 +852,7 @@
           <w:color w:val="0A1A01"/>
           <w:sz w:val="22"/>
         </w:rPr>
-        <w:t>Face à la concurrence, ma différence tient en une phrase : je suis la seule à combiner expertise agronomique et maîtrise digitale. Les agences établies ont la méthode mais pas la connaissance du secteur ; les freelances ont les tarifs mais pas la stratégie.</w:t>
+        <w:t>Face à la concurrence, ma différence tient en une phrase : je suis la seule à combiner expertise agronomique et maîtrise digitale. Les agences établies facturent de cent trente mille à six cent mille francs par mois : elles ont la méthode, mais aucune ne parle vraiment agro. Les freelances, entre cinquante et cent cinquante mille, ont les tarifs mais pas la stratégie. Je me positionne entre les deux, avec la spécialisation en plus.</w:t>
       </w:r>
     </w:p>
     <w:p>
@@ -930,7 +946,7 @@
           <w:color w:val="0A1A01"/>
           <w:sz w:val="22"/>
         </w:rPr>
-        <w:t>Et je ne pars pas de zéro. L'entreprise est formalisée : j'ai le NINEA et le registre de commerce. J'ai construit toute l'identité de marque : le logo, la charte graphique, la bannière et la carte de visite. Ma présence digitale est en place : un site portfolio en ligne, une page professionnelle LinkedIn, une page Facebook, et Meta Business Suite configurée. Je travaille avec Canva, CapCut, et je pilote mes projets sur Trello.</w:t>
+        <w:t>Et je ne pars pas de zéro. L'entreprise est formalisée : NINEA et registre de commerce. L'identité de marque est construite : logo, charte, bannière, carte de visite. Ma présence digitale est en place : site portfolio, LinkedIn, Facebook et Meta Business Suite. Je travaille avec Canva, CapCut et Trello.</w:t>
       </w:r>
     </w:p>
     <w:p>
@@ -1056,7 +1072,7 @@
           <w:color w:val="0A1A01"/>
           <w:sz w:val="22"/>
         </w:rPr>
-        <w:t>Pour franchir cette étape, je sollicite un financement d'un million huit cent cinquante mille francs CFA. Il servira à quatre choses : mes équipements de production photo et vidéo, mes abonnements et outils sur douze mois, trois formations — analytics, marketing B2B et acquisition client — et la création d'un site vitrine professionnel.</w:t>
+        <w:t>Pour franchir cette étape, je sollicite un million huit cent cinquante mille francs CFA : mes équipements de production, mes abonnements et outils sur douze mois, trois formations — analytics, marketing B2B et acquisition client — et un site vitrine professionnel.</w:t>
       </w:r>
     </w:p>
     <w:p>
@@ -1317,7 +1333,7 @@
                 <w:color w:val="1F5E3A"/>
                 <w:sz w:val="22"/>
               </w:rPr>
-              <w:t>500 / 30 / 5</w:t>
+              <w:t>11,5 M / 2 h 24</w:t>
             </w:r>
           </w:p>
         </w:tc>
@@ -1336,7 +1352,7 @@
                 <w:color w:val="0A1A01"/>
                 <w:sz w:val="20"/>
               </w:rPr>
-              <w:t>abonnés, demandes, contrats</w:t>
+              <w:t>internautes sénégalais, usage quotidien</w:t>
             </w:r>
           </w:p>
         </w:tc>
@@ -1399,7 +1415,7 @@
                 <w:color w:val="1F5E3A"/>
                 <w:sz w:val="22"/>
               </w:rPr>
-              <w:t>3 jours</w:t>
+              <w:t>500 / 30 / 5</w:t>
             </w:r>
           </w:p>
         </w:tc>
@@ -1418,7 +1434,7 @@
                 <w:color w:val="0A1A01"/>
                 <w:sz w:val="20"/>
               </w:rPr>
-              <w:t>de publication par semaine</w:t>
+              <w:t>abonnés, demandes, contrats</w:t>
             </w:r>
           </w:p>
         </w:tc>

</xml_diff>

<commit_message>
Suppression Bibliographie et Modele Economique; equipe et ambitions simplifiees
Co-authored-by: arena-agent <297053741+arena-agent@users.noreply.github.com>
</commit_message>
<xml_diff>
--- a/Pitch_Oral_Sadiya_Digital_Agri.docx
+++ b/Pitch_Oral_Sadiya_Digital_Agri.docx
@@ -796,7 +796,7 @@
                 <w:color w:val="1AAB70"/>
                 <w:sz w:val="17"/>
               </w:rPr>
-              <w:t>Slides 14 à 17  |  2:50 → 3:30</w:t>
+              <w:t>Slides 14 à 16  |  2:50 → 3:30</w:t>
             </w:r>
           </w:p>
         </w:tc>
@@ -922,7 +922,7 @@
                 <w:color w:val="1AAB70"/>
                 <w:sz w:val="17"/>
               </w:rPr>
-              <w:t>Slides 18 à 21  |  3:30 → 4:05</w:t>
+              <w:t>Slides 17 à 20  |  3:30 → 4:05</w:t>
             </w:r>
           </w:p>
         </w:tc>
@@ -1048,7 +1048,7 @@
                 <w:color w:val="1AAB70"/>
                 <w:sz w:val="17"/>
               </w:rPr>
-              <w:t>Slide 22  |  4:05 → 4:30</w:t>
+              <w:t>Slide 21  |  4:05 → 4:30</w:t>
             </w:r>
           </w:p>
         </w:tc>

</xml_diff>

<commit_message>
Script oral realigne sur le deck 22 slides (minutages calcules) + audio regenere 4min29
Co-authored-by: arena-agent <297053741+arena-agent@users.noreply.github.com>
</commit_message>
<xml_diff>
--- a/Pitch_Oral_Sadiya_Digital_Agri.docx
+++ b/Pitch_Oral_Sadiya_Digital_Agri.docx
@@ -142,7 +142,7 @@
                 <w:color w:val="1F5E3A"/>
                 <w:sz w:val="22"/>
               </w:rPr>
-              <w:t>4 min 30</w:t>
+              <w:t>4 min 29 s</w:t>
             </w:r>
           </w:p>
         </w:tc>
@@ -178,7 +178,7 @@
                 <w:color w:val="1F5E3A"/>
                 <w:sz w:val="22"/>
               </w:rPr>
-              <w:t>± 700</w:t>
+              <w:t>± 770</w:t>
             </w:r>
           </w:p>
         </w:tc>
@@ -199,7 +199,7 @@
                 <w:color w:val="1AAB70"/>
                 <w:sz w:val="15"/>
               </w:rPr>
-              <w:t>DÉBIT</w:t>
+              <w:t>SLIDES</w:t>
             </w:r>
           </w:p>
           <w:p>
@@ -214,7 +214,7 @@
                 <w:color w:val="1F5E3A"/>
                 <w:sz w:val="22"/>
               </w:rPr>
-              <w:t>~155 mots / min</w:t>
+              <w:t>22</w:t>
             </w:r>
           </w:p>
         </w:tc>
@@ -292,7 +292,16 @@
                 <w:color w:val="1AAB70"/>
                 <w:sz w:val="17"/>
               </w:rPr>
-              <w:t>Slides 1 à 3  |  0:00 → 0:35</w:t>
+              <w:t xml:space="preserve">Slide 1 — Couverture  |  </w:t>
+            </w:r>
+            <w:r>
+              <w:rPr>
+                <w:rFonts w:ascii="Poppins" w:hAnsi="Poppins"/>
+                <w:b/>
+                <w:color w:val="1AAB70"/>
+                <w:sz w:val="17"/>
+              </w:rPr>
+              <w:t>0:00 → 0:07</w:t>
             </w:r>
           </w:p>
         </w:tc>
@@ -321,22 +330,6 @@
     </w:p>
     <w:p>
       <w:pPr>
-        <w:spacing w:before="0" w:after="160" w:line="336" w:lineRule="auto"/>
-        <w:jc w:val="both"/>
-      </w:pPr>
-      <w:r>
-        <w:rPr>
-          <w:rFonts w:ascii="Poppins" w:hAnsi="Poppins"/>
-          <w:b w:val="0"/>
-          <w:i w:val="0"/>
-          <w:color w:val="0A1A01"/>
-          <w:sz w:val="22"/>
-        </w:rPr>
-        <w:t>Je voudrais commencer par une question toute simple. Au Sénégal, nous produisons d'excellents produits locaux : du jus de baobab, du fonio, de la pâte d'arachide, de la sauce bissap. Mais si ces produits ne sont pas visibles en ligne… comment donner envie de les consommer ?</w:t>
-      </w:r>
-    </w:p>
-    <w:p>
-      <w:pPr>
         <w:spacing w:before="0" w:after="240"/>
         <w:ind w:left="227"/>
         <w:pBdr>
@@ -350,7 +343,7 @@
           <w:color w:val="42612D"/>
           <w:sz w:val="17"/>
         </w:rPr>
-        <w:t>Marquer une vraie pause de deux secondes après la question. Regarder le jury, ne pas enchaîner tout de suite.</w:t>
+        <w:t>Se présenter posément, regarder l'ensemble du jury avant de commencer.</w:t>
       </w:r>
     </w:p>
     <w:tbl>
@@ -402,7 +395,16 @@
                 <w:color w:val="1AAB70"/>
                 <w:sz w:val="17"/>
               </w:rPr>
-              <w:t>Slide 2  |  0:35 → 1:10</w:t>
+              <w:t xml:space="preserve">Slide 2  |  </w:t>
+            </w:r>
+            <w:r>
+              <w:rPr>
+                <w:rFonts w:ascii="Poppins" w:hAnsi="Poppins"/>
+                <w:b/>
+                <w:color w:val="1AAB70"/>
+                <w:sz w:val="17"/>
+              </w:rPr>
+              <w:t>0:07 → 0:45</w:t>
             </w:r>
           </w:p>
         </w:tc>
@@ -426,7 +428,7 @@
           <w:color w:val="0A1A01"/>
           <w:sz w:val="22"/>
         </w:rPr>
-        <w:t>Regardons le contexte. Fin 2025, le Sénégal compte onze millions cinq cent mille internautes, soit plus de soixante pour cent de la population, et cinq millions quatre cent mille identités actives sur les réseaux sociaux. Nos concitoyens y passent en moyenne deux heures vingt-quatre par jour. Et soixante-trois pour cent des PMI industrielles du pays évoluent dans l'agroalimentaire.</w:t>
+        <w:t>Regardons d'abord le contexte. Fin 2025, le Sénégal compte onze millions cinq cent mille internautes, soit plus de soixante pour cent de la population, et cinq millions quatre cent mille identités actives sur les réseaux sociaux. Nos concitoyens y passent en moyenne deux heures vingt-quatre par jour. Et soixante-trois pour cent des PMI industrielles du pays évoluent dans l'agroalimentaire.</w:t>
       </w:r>
     </w:p>
     <w:p>
@@ -443,22 +445,6 @@
           <w:sz w:val="22"/>
         </w:rPr>
         <w:t>Le marché est donc là. Pourtant les entreprises agroalimentaires font face à trois freins : une présence très faible sur les réseaux, un manque de stratégie — on publie sans objectif ni calendrier — et une visibilité qui ne convertit pas : des vues, parfois des likes, mais aucun client au bout.</w:t>
-      </w:r>
-    </w:p>
-    <w:p>
-      <w:pPr>
-        <w:spacing w:before="0" w:after="160" w:line="336" w:lineRule="auto"/>
-        <w:jc w:val="both"/>
-      </w:pPr>
-      <w:r>
-        <w:rPr>
-          <w:rFonts w:ascii="Poppins" w:hAnsi="Poppins"/>
-          <w:b w:val="0"/>
-          <w:i w:val="0"/>
-          <w:color w:val="0A1A01"/>
-          <w:sz w:val="22"/>
-        </w:rPr>
-        <w:t>Résultat : des produits de qualité restent inconnus, pendant que les marques importées occupent tout l'espace digital.</w:t>
       </w:r>
     </w:p>
     <w:p>
@@ -507,7 +493,7 @@
                 <w:color w:val="FFFFFF"/>
                 <w:sz w:val="23"/>
               </w:rPr>
-              <w:t>3 · La solution &amp; le marché</w:t>
+              <w:t>3 · La question</w:t>
             </w:r>
           </w:p>
         </w:tc>
@@ -528,7 +514,135 @@
                 <w:color w:val="1AAB70"/>
                 <w:sz w:val="17"/>
               </w:rPr>
-              <w:t>Slides 4 et 5  |  1:10 → 1:55</w:t>
+              <w:t xml:space="preserve">Slide 3 — Du local au digital  |  </w:t>
+            </w:r>
+            <w:r>
+              <w:rPr>
+                <w:rFonts w:ascii="Poppins" w:hAnsi="Poppins"/>
+                <w:b/>
+                <w:color w:val="1AAB70"/>
+                <w:sz w:val="17"/>
+              </w:rPr>
+              <w:t>0:45 → 1:04</w:t>
+            </w:r>
+          </w:p>
+        </w:tc>
+      </w:tr>
+    </w:tbl>
+    <w:p>
+      <w:pPr>
+        <w:spacing w:after="40"/>
+      </w:pPr>
+    </w:p>
+    <w:p>
+      <w:pPr>
+        <w:spacing w:before="0" w:after="160" w:line="336" w:lineRule="auto"/>
+        <w:jc w:val="both"/>
+      </w:pPr>
+      <w:r>
+        <w:rPr>
+          <w:rFonts w:ascii="Poppins" w:hAnsi="Poppins"/>
+          <w:b w:val="0"/>
+          <w:i w:val="0"/>
+          <w:color w:val="0A1A01"/>
+          <w:sz w:val="22"/>
+        </w:rPr>
+        <w:t>Au Sénégal, nous produisons d'excellents produits locaux : du jus de baobab, du fonio, de la pâte d'arachide, de la sauce bissap. Mais si ces produits ne sont pas visibles en ligne, comment donner envie de les consommer ?</w:t>
+      </w:r>
+    </w:p>
+    <w:p>
+      <w:pPr>
+        <w:spacing w:before="0" w:after="160" w:line="336" w:lineRule="auto"/>
+        <w:jc w:val="both"/>
+      </w:pPr>
+      <w:r>
+        <w:rPr>
+          <w:rFonts w:ascii="Poppins" w:hAnsi="Poppins"/>
+          <w:b w:val="0"/>
+          <w:i w:val="0"/>
+          <w:color w:val="0A1A01"/>
+          <w:sz w:val="22"/>
+        </w:rPr>
+        <w:t>Des produits de qualité restent inconnus, pendant que les marques importées occupent tout l'espace digital.</w:t>
+      </w:r>
+    </w:p>
+    <w:p>
+      <w:pPr>
+        <w:spacing w:before="0" w:after="240"/>
+        <w:ind w:left="227"/>
+        <w:pBdr>
+          <w:left w:val="single" w:sz="12" w:space="6" w:color="9FB8A2"/>
+        </w:pBdr>
+      </w:pPr>
+      <w:r>
+        <w:rPr>
+          <w:rFonts w:ascii="Poppins" w:hAnsi="Poppins"/>
+          <w:i/>
+          <w:color w:val="42612D"/>
+          <w:sz w:val="17"/>
+        </w:rPr>
+        <w:t>Marquer une vraie pause de deux secondes après la question. C'est le moment le plus important de l'introduction : ne pas enchaîner.</w:t>
+      </w:r>
+    </w:p>
+    <w:tbl>
+      <w:tblPr>
+        <w:tblW w:type="auto" w:w="0"/>
+        <w:jc w:val="center"/>
+        <w:tblLayout w:type="fixed"/>
+        <w:tblLook w:firstColumn="1" w:firstRow="1" w:lastColumn="0" w:lastRow="0" w:noHBand="0" w:noVBand="1" w:val="04A0"/>
+      </w:tblPr>
+      <w:tblGrid>
+        <w:gridCol w:w="7030"/>
+        <w:gridCol w:w="2381"/>
+      </w:tblGrid>
+      <w:tr>
+        <w:tc>
+          <w:tcPr>
+            <w:tcW w:type="dxa" w:w="7030"/>
+            <w:shd w:val="clear" w:fill="1F5E3A"/>
+          </w:tcPr>
+          <w:p>
+            <w:pPr>
+              <w:spacing w:before="60" w:after="60"/>
+            </w:pPr>
+            <w:r>
+              <w:rPr>
+                <w:rFonts w:ascii="Poppins" w:hAnsi="Poppins"/>
+                <w:b/>
+                <w:color w:val="FFFFFF"/>
+                <w:sz w:val="23"/>
+              </w:rPr>
+              <w:t>4 · La solution &amp; le marché</w:t>
+            </w:r>
+          </w:p>
+        </w:tc>
+        <w:tc>
+          <w:tcPr>
+            <w:tcW w:type="dxa" w:w="2381"/>
+            <w:shd w:val="clear" w:fill="1F5E3A"/>
+          </w:tcPr>
+          <w:p>
+            <w:pPr>
+              <w:spacing w:before="60" w:after="60"/>
+              <w:jc w:val="right"/>
+            </w:pPr>
+            <w:r>
+              <w:rPr>
+                <w:rFonts w:ascii="Poppins" w:hAnsi="Poppins"/>
+                <w:b/>
+                <w:color w:val="1AAB70"/>
+                <w:sz w:val="17"/>
+              </w:rPr>
+              <w:t xml:space="preserve">Slides 4 et 5  |  </w:t>
+            </w:r>
+            <w:r>
+              <w:rPr>
+                <w:rFonts w:ascii="Poppins" w:hAnsi="Poppins"/>
+                <w:b/>
+                <w:color w:val="1AAB70"/>
+                <w:sz w:val="17"/>
+              </w:rPr>
+              <w:t>1:04 → 1:43</w:t>
             </w:r>
           </w:p>
         </w:tc>
@@ -633,7 +747,7 @@
                 <w:color w:val="FFFFFF"/>
                 <w:sz w:val="23"/>
               </w:rPr>
-              <w:t>4 · La stratégie TOMSTER</w:t>
+              <w:t>5 · La stratégie TOMSTER</w:t>
             </w:r>
           </w:p>
         </w:tc>
@@ -654,7 +768,16 @@
                 <w:color w:val="1AAB70"/>
                 <w:sz w:val="17"/>
               </w:rPr>
-              <w:t>Slides 6 à 13  |  1:55 → 2:50</w:t>
+              <w:t xml:space="preserve">Slides 6 à 13  |  </w:t>
+            </w:r>
+            <w:r>
+              <w:rPr>
+                <w:rFonts w:ascii="Poppins" w:hAnsi="Poppins"/>
+                <w:b/>
+                <w:color w:val="1AAB70"/>
+                <w:sz w:val="17"/>
+              </w:rPr>
+              <w:t>1:43 → 2:26</w:t>
             </w:r>
           </w:p>
         </w:tc>
@@ -744,7 +867,7 @@
           <w:color w:val="42612D"/>
           <w:sz w:val="17"/>
         </w:rPr>
-        <w:t>Section dense : ne pas accélérer. Si le temps manque, supprimer la phrase sur les cinq piliers, pas les chiffres.</w:t>
+        <w:t>Section dense : huit slides défilent vite. Ne pas accélérer le débit, c'est le visuel qui porte le détail.</w:t>
       </w:r>
     </w:p>
     <w:tbl>
@@ -775,7 +898,7 @@
                 <w:color w:val="FFFFFF"/>
                 <w:sz w:val="23"/>
               </w:rPr>
-              <w:t>5 · Modèle économique &amp; benchmark</w:t>
+              <w:t>6 · Modèle économique &amp; benchmark</w:t>
             </w:r>
           </w:p>
         </w:tc>
@@ -796,7 +919,16 @@
                 <w:color w:val="1AAB70"/>
                 <w:sz w:val="17"/>
               </w:rPr>
-              <w:t>Slides 14 à 16  |  2:50 → 3:30</w:t>
+              <w:t xml:space="preserve">Slides 14 à 16  |  </w:t>
+            </w:r>
+            <w:r>
+              <w:rPr>
+                <w:rFonts w:ascii="Poppins" w:hAnsi="Poppins"/>
+                <w:b/>
+                <w:color w:val="1AAB70"/>
+                <w:sz w:val="17"/>
+              </w:rPr>
+              <w:t>2:26 → 3:15</w:t>
             </w:r>
           </w:p>
         </w:tc>
@@ -901,7 +1033,7 @@
                 <w:color w:val="FFFFFF"/>
                 <w:sz w:val="23"/>
               </w:rPr>
-              <w:t>6 · Réalisations &amp; équipe</w:t>
+              <w:t>7 · Réalisations &amp; équipe</w:t>
             </w:r>
           </w:p>
         </w:tc>
@@ -922,7 +1054,16 @@
                 <w:color w:val="1AAB70"/>
                 <w:sz w:val="17"/>
               </w:rPr>
-              <w:t>Slides 17 à 20  |  3:30 → 4:05</w:t>
+              <w:t xml:space="preserve">Slides 17 à 20  |  </w:t>
+            </w:r>
+            <w:r>
+              <w:rPr>
+                <w:rFonts w:ascii="Poppins" w:hAnsi="Poppins"/>
+                <w:b/>
+                <w:color w:val="1AAB70"/>
+                <w:sz w:val="17"/>
+              </w:rPr>
+              <w:t>3:15 → 3:57</w:t>
             </w:r>
           </w:p>
         </w:tc>
@@ -1027,7 +1168,7 @@
                 <w:color w:val="FFFFFF"/>
                 <w:sz w:val="23"/>
               </w:rPr>
-              <w:t>7 · L'appel à l'action</w:t>
+              <w:t>8 · L'appel à l'action</w:t>
             </w:r>
           </w:p>
         </w:tc>
@@ -1048,7 +1189,16 @@
                 <w:color w:val="1AAB70"/>
                 <w:sz w:val="17"/>
               </w:rPr>
-              <w:t>Slide 21  |  4:05 → 4:30</w:t>
+              <w:t xml:space="preserve">Slide 21  |  </w:t>
+            </w:r>
+            <w:r>
+              <w:rPr>
+                <w:rFonts w:ascii="Poppins" w:hAnsi="Poppins"/>
+                <w:b/>
+                <w:color w:val="1AAB70"/>
+                <w:sz w:val="17"/>
+              </w:rPr>
+              <w:t>3:57 → 4:29</w:t>
             </w:r>
           </w:p>
         </w:tc>
@@ -1122,7 +1272,7 @@
           <w:color w:val="42612D"/>
           <w:sz w:val="17"/>
         </w:rPr>
-        <w:t>Dernière phrase : ralentir nettement, regarder le jury, sourire. Ne pas enchaîner sur autre chose — laisser le silence.</w:t>
+        <w:t>Dernière phrase : ralentir nettement, regarder le jury, sourire. Slide 22 « Merci » affichée pendant les questions.</w:t>
       </w:r>
     </w:p>
     <w:p>

</xml_diff>

<commit_message>
Ajout page Conclusion (slide 22) + script et audio mis a jour (4min54)
Co-authored-by: arena-agent <297053741+arena-agent@users.noreply.github.com>
</commit_message>
<xml_diff>
--- a/Pitch_Oral_Sadiya_Digital_Agri.docx
+++ b/Pitch_Oral_Sadiya_Digital_Agri.docx
@@ -142,7 +142,7 @@
                 <w:color w:val="1F5E3A"/>
                 <w:sz w:val="22"/>
               </w:rPr>
-              <w:t>4 min 29 s</w:t>
+              <w:t>4 min 54 s</w:t>
             </w:r>
           </w:p>
         </w:tc>
@@ -178,7 +178,7 @@
                 <w:color w:val="1F5E3A"/>
                 <w:sz w:val="22"/>
               </w:rPr>
-              <w:t>± 770</w:t>
+              <w:t>± 820</w:t>
             </w:r>
           </w:p>
         </w:tc>
@@ -214,7 +214,7 @@
                 <w:color w:val="1F5E3A"/>
                 <w:sz w:val="22"/>
               </w:rPr>
-              <w:t>22</w:t>
+              <w:t>23</w:t>
             </w:r>
           </w:p>
         </w:tc>
@@ -404,7 +404,7 @@
                 <w:color w:val="1AAB70"/>
                 <w:sz w:val="17"/>
               </w:rPr>
-              <w:t>0:07 → 0:45</w:t>
+              <w:t>0:07 → 0:44</w:t>
             </w:r>
           </w:p>
         </w:tc>
@@ -428,7 +428,7 @@
           <w:color w:val="0A1A01"/>
           <w:sz w:val="22"/>
         </w:rPr>
-        <w:t>Regardons d'abord le contexte. Fin 2025, le Sénégal compte onze millions cinq cent mille internautes, soit plus de soixante pour cent de la population, et cinq millions quatre cent mille identités actives sur les réseaux sociaux. Nos concitoyens y passent en moyenne deux heures vingt-quatre par jour. Et soixante-trois pour cent des PMI industrielles du pays évoluent dans l'agroalimentaire.</w:t>
+        <w:t>Regardons d'abord le contexte. Fin 2025, le Sénégal compte onze millions cinq cent mille internautes et cinq millions quatre cent mille identités actives sur les réseaux sociaux, où nos concitoyens passent en moyenne deux heures vingt-quatre par jour. Et soixante-trois pour cent des PMI industrielles du pays évoluent dans l'agroalimentaire.</w:t>
       </w:r>
     </w:p>
     <w:p>
@@ -523,7 +523,7 @@
                 <w:color w:val="1AAB70"/>
                 <w:sz w:val="17"/>
               </w:rPr>
-              <w:t>0:45 → 1:04</w:t>
+              <w:t>0:44 → 1:03</w:t>
             </w:r>
           </w:p>
         </w:tc>
@@ -642,7 +642,7 @@
                 <w:color w:val="1AAB70"/>
                 <w:sz w:val="17"/>
               </w:rPr>
-              <w:t>1:04 → 1:43</w:t>
+              <w:t>1:03 → 1:41</w:t>
             </w:r>
           </w:p>
         </w:tc>
@@ -682,7 +682,7 @@
           <w:color w:val="0A1A01"/>
           <w:sz w:val="22"/>
         </w:rPr>
-        <w:t>Ce qui me différencie, c'est une double expertise. J'ai une licence en agronomie à l'UCAD, donc je connais le terrain, les producteurs, les contraintes du secteur. Et j'ai été formée sept semaines en design et community management à Simplon Sénégal. Cette combinaison, agriculture et digital, personne ne la propose aujourd'hui sur ce marché.</w:t>
+        <w:t>Ce qui me différencie, c'est une double expertise. Une licence en agronomie à l'UCAD : je connais le terrain, les producteurs, les contraintes du secteur. Et sept semaines de formation en community management à Simplon Sénégal. Cette combinaison, personne ne la propose aujourd'hui sur ce marché.</w:t>
       </w:r>
     </w:p>
     <w:p>
@@ -777,7 +777,7 @@
                 <w:color w:val="1AAB70"/>
                 <w:sz w:val="17"/>
               </w:rPr>
-              <w:t>1:43 → 2:26</w:t>
+              <w:t>1:41 → 2:25</w:t>
             </w:r>
           </w:p>
         </w:tc>
@@ -928,7 +928,7 @@
                 <w:color w:val="1AAB70"/>
                 <w:sz w:val="17"/>
               </w:rPr>
-              <w:t>2:26 → 3:15</w:t>
+              <w:t>2:25 → 3:15</w:t>
             </w:r>
           </w:p>
         </w:tc>
@@ -1063,7 +1063,7 @@
                 <w:color w:val="1AAB70"/>
                 <w:sz w:val="17"/>
               </w:rPr>
-              <w:t>3:15 → 3:57</w:t>
+              <w:t>3:15 → 3:54</w:t>
             </w:r>
           </w:p>
         </w:tc>
@@ -1087,7 +1087,7 @@
           <w:color w:val="0A1A01"/>
           <w:sz w:val="22"/>
         </w:rPr>
-        <w:t>Et je ne pars pas de zéro. L'entreprise est formalisée : NINEA et registre de commerce. L'identité de marque est construite : logo, charte, bannière, carte de visite. Ma présence digitale est en place : site portfolio, LinkedIn, Facebook et Meta Business Suite. Je travaille avec Canva, CapCut et Trello.</w:t>
+        <w:t>Et je ne pars pas de zéro. L'entreprise est formalisée : NINEA et registre de commerce. L'identité de marque est construite. Ma présence digitale est en place : site portfolio, LinkedIn, Facebook et Meta Business Suite.</w:t>
       </w:r>
     </w:p>
     <w:p>
@@ -1198,7 +1198,7 @@
                 <w:color w:val="1AAB70"/>
                 <w:sz w:val="17"/>
               </w:rPr>
-              <w:t>3:57 → 4:29</w:t>
+              <w:t>3:54 → 4:20</w:t>
             </w:r>
           </w:p>
         </w:tc>
@@ -1243,6 +1243,125 @@
     </w:p>
     <w:p>
       <w:pPr>
+        <w:spacing w:before="0" w:after="240"/>
+        <w:ind w:left="227"/>
+        <w:pBdr>
+          <w:left w:val="single" w:sz="12" w:space="6" w:color="9FB8A2"/>
+        </w:pBdr>
+      </w:pPr>
+      <w:r>
+        <w:rPr>
+          <w:rFonts w:ascii="Poppins" w:hAnsi="Poppins"/>
+          <w:i/>
+          <w:color w:val="42612D"/>
+          <w:sz w:val="17"/>
+        </w:rPr>
+        <w:t>Enchaîner directement sur la conclusion, sans marquer de fin.</w:t>
+      </w:r>
+    </w:p>
+    <w:tbl>
+      <w:tblPr>
+        <w:tblW w:type="auto" w:w="0"/>
+        <w:jc w:val="center"/>
+        <w:tblLayout w:type="fixed"/>
+        <w:tblLook w:firstColumn="1" w:firstRow="1" w:lastColumn="0" w:lastRow="0" w:noHBand="0" w:noVBand="1" w:val="04A0"/>
+      </w:tblPr>
+      <w:tblGrid>
+        <w:gridCol w:w="7030"/>
+        <w:gridCol w:w="2381"/>
+      </w:tblGrid>
+      <w:tr>
+        <w:tc>
+          <w:tcPr>
+            <w:tcW w:type="dxa" w:w="7030"/>
+            <w:shd w:val="clear" w:fill="1F5E3A"/>
+          </w:tcPr>
+          <w:p>
+            <w:pPr>
+              <w:spacing w:before="60" w:after="60"/>
+            </w:pPr>
+            <w:r>
+              <w:rPr>
+                <w:rFonts w:ascii="Poppins" w:hAnsi="Poppins"/>
+                <w:b/>
+                <w:color w:val="FFFFFF"/>
+                <w:sz w:val="23"/>
+              </w:rPr>
+              <w:t>9 · Conclusion</w:t>
+            </w:r>
+          </w:p>
+        </w:tc>
+        <w:tc>
+          <w:tcPr>
+            <w:tcW w:type="dxa" w:w="2381"/>
+            <w:shd w:val="clear" w:fill="1F5E3A"/>
+          </w:tcPr>
+          <w:p>
+            <w:pPr>
+              <w:spacing w:before="60" w:after="60"/>
+              <w:jc w:val="right"/>
+            </w:pPr>
+            <w:r>
+              <w:rPr>
+                <w:rFonts w:ascii="Poppins" w:hAnsi="Poppins"/>
+                <w:b/>
+                <w:color w:val="1AAB70"/>
+                <w:sz w:val="17"/>
+              </w:rPr>
+              <w:t xml:space="preserve">Slides 22 et 23  |  </w:t>
+            </w:r>
+            <w:r>
+              <w:rPr>
+                <w:rFonts w:ascii="Poppins" w:hAnsi="Poppins"/>
+                <w:b/>
+                <w:color w:val="1AAB70"/>
+                <w:sz w:val="17"/>
+              </w:rPr>
+              <w:t>4:20 → 4:54</w:t>
+            </w:r>
+          </w:p>
+        </w:tc>
+      </w:tr>
+    </w:tbl>
+    <w:p>
+      <w:pPr>
+        <w:spacing w:after="40"/>
+      </w:pPr>
+    </w:p>
+    <w:p>
+      <w:pPr>
+        <w:spacing w:before="0" w:after="160" w:line="336" w:lineRule="auto"/>
+        <w:jc w:val="both"/>
+      </w:pPr>
+      <w:r>
+        <w:rPr>
+          <w:rFonts w:ascii="Poppins" w:hAnsi="Poppins"/>
+          <w:b w:val="0"/>
+          <w:i w:val="0"/>
+          <w:color w:val="0A1A01"/>
+          <w:sz w:val="22"/>
+        </w:rPr>
+        <w:t>En résumé, trois choses. Un marché porteur et inexploité : cinq millions de Sénégalais sur les réseaux, une majorité de PMI dans l'agroalimentaire, et aucune agence spécialisée sur ce créneau. Une expertise unique : l'agronomie et le digital réunis. Et un projet déjà lancé, pas une simple idée : l'entreprise est créée, la marque existe, les offres sont prêtes.</w:t>
+      </w:r>
+    </w:p>
+    <w:p>
+      <w:pPr>
+        <w:spacing w:before="0" w:after="160" w:line="336" w:lineRule="auto"/>
+        <w:jc w:val="both"/>
+      </w:pPr>
+      <w:r>
+        <w:rPr>
+          <w:rFonts w:ascii="Poppins" w:hAnsi="Poppins"/>
+          <w:b w:val="0"/>
+          <w:i w:val="0"/>
+          <w:color w:val="0A1A01"/>
+          <w:sz w:val="22"/>
+        </w:rPr>
+        <w:t>Ce qui me manque aujourd'hui, ce sont les moyens de passer à l'échelle. C'est tout le sens de ma demande.</w:t>
+      </w:r>
+    </w:p>
+    <w:p>
+      <w:pPr>
         <w:spacing w:before="0" w:after="160" w:line="336" w:lineRule="auto"/>
         <w:jc w:val="both"/>
       </w:pPr>
@@ -1272,7 +1391,7 @@
           <w:color w:val="42612D"/>
           <w:sz w:val="17"/>
         </w:rPr>
-        <w:t>Dernière phrase : ralentir nettement, regarder le jury, sourire. Slide 22 « Merci » affichée pendant les questions.</w:t>
+        <w:t>Dernière phrase : ralentir nettement, regarder le jury, sourire. Slide 23 « Merci » affichée pendant les questions.</w:t>
       </w:r>
     </w:p>
     <w:p>

</xml_diff>